<commit_message>
Log resolution meeting: pass/fail path accepted by university, Ch4-6 spec, simulated-data exercise (separate from paper), Fri/Sun/Tue deadlines; add post-meeting confirmation email
Co-Authored-By: Claude Fable 5 <noreply@anthropic.com>
Claude-Session: https://claude.ai/code/session_019uQWfMoV11me5yJ6LYRtPv
</commit_message>
<xml_diff>
--- a/dba/00_Execution/Advisor_Meeting_Record.docx
+++ b/dba/00_Execution/Advisor_Meeting_Record.docx
@@ -179,6 +179,177 @@
       </w:r>
     </w:p>
     <w:p>
+      <w:pPr>
+        <w:pStyle w:val="Heading2"/>
+      </w:pPr>
+      <w:r>
+        <w:t>Late July 2026 — Resolution Meeting (small sample, path to completion)</w:t>
+      </w:r>
+    </w:p>
+    <w:p>
+      <w:r>
+        <w:rPr>
+          <w:b/>
+        </w:rPr>
+        <w:t>The pivotal meeting.</w:t>
+      </w:r>
+      <w:r>
+        <w:t xml:space="preserve"> With only a handful of usable responses collected, Dr. Rey proposed a solution to the university — and the university accepted it. Key outcomes:</w:t>
+      </w:r>
+    </w:p>
+    <w:p>
+      <w:pPr>
+        <w:pStyle w:val="ListNumber"/>
+      </w:pPr>
+      <w:r>
+        <w:rPr>
+          <w:b/>
+        </w:rPr>
+        <w:t>Course is pass/fail</w:t>
+      </w:r>
+      <w:r>
+        <w:t xml:space="preserve"> — no score needed; the goal is a quality submission that passes.</w:t>
+      </w:r>
+    </w:p>
+    <w:p>
+      <w:pPr>
+        <w:pStyle w:val="ListNumber"/>
+      </w:pPr>
+      <w:r>
+        <w:rPr>
+          <w:b/>
+        </w:rPr>
+        <w:t>Chapters 1–3 stand</w:t>
+      </w:r>
+      <w:r>
+        <w:t xml:space="preserve"> — no revisions needed there.</w:t>
+      </w:r>
+    </w:p>
+    <w:p>
+      <w:pPr>
+        <w:pStyle w:val="ListNumber"/>
+      </w:pPr>
+      <w:r>
+        <w:rPr>
+          <w:b/>
+        </w:rPr>
+        <w:t>Chapter 4 (Methodology):</w:t>
+      </w:r>
+      <w:r>
+        <w:t xml:space="preserve"> rewrite as a detailed </w:t>
+      </w:r>
+      <w:r>
+        <w:rPr>
+          <w:i/>
+        </w:rPr>
+        <w:t>contract</w:t>
+      </w:r>
+      <w:r>
+        <w:t xml:space="preserve"> of everything the study planned to do — full analytic sequence with criteria: cleaning protocol, EFA (KMO/Bartlett, PAF, retention rules, both rotations/Oblimin, item thresholds), reliability, CFA (fit indices), regression (diagnostics), PLS-SEM, mediation. The detail itself demonstrates scientific competence.</w:t>
+      </w:r>
+    </w:p>
+    <w:p>
+      <w:pPr>
+        <w:pStyle w:val="ListNumber"/>
+      </w:pPr>
+      <w:r>
+        <w:rPr>
+          <w:b/>
+        </w:rPr>
+        <w:t>Chapter 5 (Data Analysis):</w:t>
+      </w:r>
+      <w:r>
+        <w:t xml:space="preserve"> document the full collection experience — pilot results, Qualtrics + CloudResearch, the challenges, the population-specificity problem, the economics. </w:t>
+      </w:r>
+      <w:r>
+        <w:rPr>
+          <w:b/>
+        </w:rPr>
+        <w:t>Do not state the exact respondent count</w:t>
+      </w:r>
+      <w:r>
+        <w:t xml:space="preserve"> (say "only 4–5 responses were obtained"); </w:t>
+      </w:r>
+      <w:r>
+        <w:rPr>
+          <w:b/>
+        </w:rPr>
+        <w:t>do not reproduce raw Qualtrics data</w:t>
+      </w:r>
+      <w:r>
+        <w:t xml:space="preserve"> (platform terms). Close the chapter stating the required analyses (EFA, CFA, regression, PLS) could not be performed.</w:t>
+      </w:r>
+    </w:p>
+    <w:p>
+      <w:pPr>
+        <w:pStyle w:val="ListNumber"/>
+      </w:pPr>
+      <w:r>
+        <w:rPr>
+          <w:b/>
+        </w:rPr>
+        <w:t>Chapter 6 (Conclusions):</w:t>
+      </w:r>
+      <w:r>
+        <w:t xml:space="preserve"> limitations first (tiny, highly specific population — U.S. auditors), then recommendations (start collection extremely early — a week for others can be a year here; 20–30 respondents is a meaningful threshold; consider broadening the population), then reflection on adapting the work into the dissertation (change venue/scope for a collectible sample).</w:t>
+      </w:r>
+    </w:p>
+    <w:p>
+      <w:pPr>
+        <w:pStyle w:val="ListNumber"/>
+      </w:pPr>
+      <w:r>
+        <w:rPr>
+          <w:b/>
+        </w:rPr>
+        <w:t>Parallel simulated-data exercise:</w:t>
+      </w:r>
+      <w:r>
+        <w:t xml:space="preserve"> Dr. Rey built a simulated dataset with the same constructs; Yasir completes a data-analysis exercise on it </w:t>
+      </w:r>
+      <w:r>
+        <w:rPr>
+          <w:i/>
+        </w:rPr>
+        <w:t>separately</w:t>
+      </w:r>
+      <w:r>
+        <w:t xml:space="preserve"> to demonstrate analytic competency to the university. </w:t>
+      </w:r>
+      <w:r>
+        <w:rPr>
+          <w:b/>
+        </w:rPr>
+        <w:t>It is not mentioned in the paper.</w:t>
+      </w:r>
+      <w:r>
+        <w:t xml:space="preserve"> He sends it only after the three chapters are submitted.</w:t>
+      </w:r>
+    </w:p>
+    <w:p>
+      <w:pPr>
+        <w:pStyle w:val="ListNumber"/>
+      </w:pPr>
+      <w:r>
+        <w:rPr>
+          <w:b/>
+        </w:rPr>
+        <w:t>Deadlines:</w:t>
+      </w:r>
+      <w:r>
+        <w:t xml:space="preserve"> target Friday; Sunday at the latest; </w:t>
+      </w:r>
+      <w:r>
+        <w:rPr>
+          <w:b/>
+        </w:rPr>
+        <w:t>Tuesday is the hard deadline</w:t>
+      </w:r>
+      <w:r>
+        <w:t xml:space="preserve"> — after that he must submit an Incomplete. Quality over speed within that window.</w:t>
+      </w:r>
+    </w:p>
+    <w:p>
       <w:r>
         <w:rPr>
           <w:b/>
@@ -186,7 +357,16 @@
         <w:t>Status:</w:t>
       </w:r>
       <w:r>
-        <w:t xml:space="preserve"> Both sets of requirements were implemented in </w:t>
+        <w:t xml:space="preserve"> Chapters 4–6 rewritten to this spec in </w:t>
+      </w:r>
+      <w:r>
+        <w:rPr>
+          <w:rFonts w:ascii="Courier New" w:hAnsi="Courier New"/>
+        </w:rPr>
+        <w:t>Research_Paper_YMalik_CH4-6_DRAFT.md</w:t>
+      </w:r>
+      <w:r>
+        <w:t xml:space="preserve"> (v2), adversarially verified against each constraint above. Chapters 2–3 remain as implemented in </w:t>
       </w:r>
       <w:r>
         <w:rPr>
@@ -195,7 +375,7 @@
         <w:t>Research_Paper_YMalik_v4_master.md</w:t>
       </w:r>
       <w:r>
-        <w:t xml:space="preserve"> (11 construct sections, theory section, model figure, 16 hypothesis sections, Appendix A instrument).</w:t>
+        <w:t>.</w:t>
       </w:r>
     </w:p>
     <w:sectPr>

</xml_diff>

<commit_message>
Correct meeting record + confirmation email: Chapter 1 also requires significant revision per Dr. Rey (not untouched as first minuted)
Co-Authored-By: Claude Fable 5 <noreply@anthropic.com>
Claude-Session: https://claude.ai/code/session_019uQWfMoV11me5yJ6LYRtPv
</commit_message>
<xml_diff>
--- a/dba/00_Execution/Advisor_Meeting_Record.docx
+++ b/dba/00_Execution/Advisor_Meeting_Record.docx
@@ -219,10 +219,25 @@
         <w:rPr>
           <w:b/>
         </w:rPr>
-        <w:t>Chapters 1–3 stand</w:t>
+        <w:t>Chapters 2–3 stand</w:t>
       </w:r>
       <w:r>
-        <w:t xml:space="preserve"> — no revisions needed there.</w:t>
+        <w:t xml:space="preserve"> — no revisions needed there. </w:t>
+      </w:r>
+      <w:r>
+        <w:rPr>
+          <w:b/>
+        </w:rPr>
+        <w:t>Chapter 1, however, needs significant improvement</w:t>
+      </w:r>
+      <w:r>
+        <w:t xml:space="preserve"> (correction to the initial minutes, per Yasir's recollection: Dr. Rey spoke at length about revising Chapter 1) — it must be reworked to properly frame the study as executed. </w:t>
+      </w:r>
+      <w:r>
+        <w:rPr>
+          <w:i/>
+        </w:rPr>
+        <w:t>Specifics of his Chapter 1 feedback to be captured from Yasir before the revision.</w:t>
       </w:r>
     </w:p>
     <w:p>

</xml_diff>